<commit_message>
fix(lecons): corrige l'assiette de la CSG-CRDS (leçon placement 11)
- Le corrigé affirmait que la prime d'intéressement placée par le
  salarié échappe à la CSG-CRDS. Faux : les 9,7 % frappent à l'entrée
  du plan l'intéressement, la participation et l'abondement ; seuls
  les versements volontaires y échappent. L'exonération obtenue en
  plaçant sous 15 jours ne porte que sur l'impôt sur le revenu.
- Challenge recalculé : scénario B à 4 334,40 € (et non 4 567,20 €),
  scénario A entre 1 447 € et 1 496 € (et non 1 622,40 €), ratio ≈ 2,9.
  La conclusion du challenge n'est pas modifiée.
- Incertitude levée sur les gains PEE à la sortie : 18,6 %, avec la
  distinction d'avec la CSG-CRDS d'entrée, inchangée en 2026 car la
  hausse de CSG vise les revenus du capital, pas ceux d'activité.

Formulations d'origine conservées dans le journal des corrections.

Co-Authored-By: Claude Opus 5 <noreply@anthropic.com>
</commit_message>
<xml_diff>
--- a/livrables/lecons/2026-08-22_lecon-placement-financier_11_epargne-salariale-pee-pereco-interessement-abondement.docx
+++ b/livrables/lecons/2026-08-22_lecon-placement-financier_11_epargne-salariale-pee-pereco-interessement-abondement.docx
@@ -1113,7 +1113,7 @@
                 <w:sz w:val="22"/>
                 <w:szCs w:val="22"/>
               </w:rPr>
-              <w:t xml:space="preserve">⚠️ Taux des prélèvements sociaux sur les gains PEE à la sortie : economie.gouv.fr indique 17,2 % (page consultée le 22/08/2026, mais potentiellement non mise à jour). Depuis le 01/01/2026, le taux général des prélèvements sociaux sur les revenus du capital est passé à 18,6 % (source : lafinancepourtous.com, accès 2026-08-22). Les exceptions maintenues à 17,2 % concernent l'assurance-vie, les CEL/PEL ouverts avant le 31/12/2017 et les PEP — le PEE ne figure pas explicitement dans ces exceptions. Vérification recommandée sur impots.gouv.fr avant toute décision.</w:t>
+              <w:t xml:space="preserve">📌 Taux des prélèvements sociaux sur les gains PEE à la sortie : 18,6 % depuis le 01/01/2026 (lafinancepourtous.com, page « La fiscalité de l'épargne salariale », vérifiée le 22/08/2026, qui l'écrit explicitement pour la sortie de PEE). La page correspondante d'economie.gouv.fr affichait encore 17,2 % le même jour : elle n'est pas à jour sur ce point. Les exceptions réellement maintenues à 17,2 % sont l'assurance-vie, les CEL/PEL ouverts avant le 31/12/2017 et les PEP ; le PEE n'en fait pas partie. À distinguer soigneusement de la CSG-CRDS de 9,7 % prélevée à l'ENTRÉE du plan : celle-ci n'a pas bougé en 2026, car la hausse de CSG vise les revenus du capital et non les revenus d'activité.</w:t>
             </w:r>
           </w:p>
         </w:tc>
@@ -2334,7 +2334,7 @@
           <w:sz w:val="22"/>
           <w:szCs w:val="22"/>
         </w:rPr>
-        <w:t xml:space="preserve">A — Il s'agit de l'intéressement. Placé dans les 15 jours sur le PEE, il est exonéré d'IR. La CSG-CRDS (9,7 %) est prélevée à l'entrée sur l'abondement si l'employeur abonde, mais pas sur la prime d'intéressement elle-même placée par le salarié.</w:t>
+        <w:t xml:space="preserve">A — Il s'agit de l'intéressement. Placé dans les 15 jours sur le PEE, il est exonéré d'IR. Attention à ne pas confondre les deux exonérations : placer la prime sous 15 jours l'exonère de l'IMPÔT SUR LE REVENU, pas de la CSG-CRDS. Les 9,7 % sont prélevés à l'entrée du plan sur l'intéressement, sur la participation ET sur l'abondement. Seuls les versements volontaires y échappent, puisqu'ils proviennent d'un salaire déjà soumis à la CSG.</w:t>
       </w:r>
     </w:p>
     <w:p>
@@ -3397,30 +3397,30 @@
           <w:sz w:val="22"/>
           <w:szCs w:val="22"/>
         </w:rPr>
-        <w:t xml:space="preserve">CSG-CRDS non déductible (environ 2,4 % × 2 400 €) : 57,60 €</w:t>
-      </w:r>
-    </w:p>
-    <w:p>
-      <w:pPr>
-        <w:pStyle w:val="ListParagraph"/>
-        <w:numPr>
-          <w:ilvl w:val="0"/>
-          <w:numId w:val="1"/>
-        </w:numPr>
-        <w:spacing w:after="60" w:before="60"/>
-      </w:pPr>
-      <w:r>
-        <w:rPr>
-          <w:rFonts w:ascii="Times New Roman" w:cs="Times New Roman" w:eastAsia="Times New Roman" w:hAnsi="Times New Roman"/>
-          <w:b w:val="false"/>
-          <w:bCs w:val="false"/>
-          <w:i w:val="false"/>
-          <w:iCs w:val="false"/>
-          <w:color w:val="1F2937"/>
-          <w:sz w:val="22"/>
-          <w:szCs w:val="22"/>
-        </w:rPr>
-        <w:t xml:space="preserve">Net en poche ≈ 2 400 − 720 − 57,60 = 1 622,40 €</w:t>
+        <w:t xml:space="preserve">CSG-CRDS prélevée à la source (9,7 % × 2 400 €) : 232,80 € — c'est bien la totalité des 9,7 % qui est retenue, et non la seule fraction non déductible</w:t>
+      </w:r>
+    </w:p>
+    <w:p>
+      <w:pPr>
+        <w:pStyle w:val="ListParagraph"/>
+        <w:numPr>
+          <w:ilvl w:val="0"/>
+          <w:numId w:val="1"/>
+        </w:numPr>
+        <w:spacing w:after="60" w:before="60"/>
+      </w:pPr>
+      <w:r>
+        <w:rPr>
+          <w:rFonts w:ascii="Times New Roman" w:cs="Times New Roman" w:eastAsia="Times New Roman" w:hAnsi="Times New Roman"/>
+          <w:b w:val="false"/>
+          <w:bCs w:val="false"/>
+          <w:i w:val="false"/>
+          <w:iCs w:val="false"/>
+          <w:color w:val="1F2937"/>
+          <w:sz w:val="22"/>
+          <w:szCs w:val="22"/>
+        </w:rPr>
+        <w:t xml:space="preserve">Net en poche ≈ 2 400 − 232,80 − IR. L'IR se situe entre 671 € (si la CSG déductible de 6,8 % vient réduire la base imposable) et 720 € (si elle ne la réduit pas), soit un net compris entre 1 447 € et 1 496 € — retenons environ 1 475 €. Ce point précis relève du conseiller : ce qui compte ici est l'ordre de grandeur, pas la décimale.</w:t>
       </w:r>
     </w:p>
     <w:p>
@@ -3461,7 +3461,7 @@
           <w:sz w:val="22"/>
           <w:szCs w:val="22"/>
         </w:rPr>
-        <w:t xml:space="preserve">Prime placée : 2 400 € (exonérée d'IR)</w:t>
+        <w:t xml:space="preserve">Prime placée : 2 400 €, exonérée d'IR mais soumise à la CSG-CRDS de 9,7 % (232,80 €) → 2 167,20 € réellement placés</w:t>
       </w:r>
     </w:p>
     <w:p>
@@ -3553,7 +3553,7 @@
           <w:sz w:val="22"/>
           <w:szCs w:val="22"/>
         </w:rPr>
-        <w:t xml:space="preserve">Total dans le PERECO : 2 400 + 2 167,20 = 4 567,20 €, bloqué jusqu'à la retraite (sauf cas de déblocage)</w:t>
+        <w:t xml:space="preserve">Total dans le PERECO : 2 167,20 + 2 167,20 = 4 334,40 €, bloqué jusqu'à la retraite (sauf cas de déblocage)</w:t>
       </w:r>
     </w:p>
     <w:p>
@@ -3686,7 +3686,7 @@
           <w:sz w:val="22"/>
           <w:szCs w:val="22"/>
         </w:rPr>
-        <w:t xml:space="preserve">Ratio : 4 567,20 € / 1 622,40 € ≈ 2,82. Vous placez 2,82 fois plus que vous n'auriez eu en net en poche. Même si les 4 567 € sont bloqués, leur valeur potentielle à terme est considérablement supérieure — c'est le levier combiné de l'exonération IR et de l'abondement.</w:t>
+        <w:t xml:space="preserve">Ratio : 4 334,40 € / ≈ 1 475 € ≈ 2,9. Vous placez près de trois fois ce que vous auriez eu en net en poche. Même si les 4 334 € sont bloqués, leur valeur potentielle à terme est considérablement supérieure — c'est le levier combiné de l'exonération IR et de l'abondement.</w:t>
       </w:r>
     </w:p>
     <w:p>
@@ -4159,6 +4159,150 @@
           <w:szCs w:val="20"/>
         </w:rPr>
         <w:t xml:space="preserve">Parcours Placement financier — Leçon 11 / 20 — Éducation financière générale, sans conseil en investissement personnalisé — 22 août 2026</w:t>
+      </w:r>
+    </w:p>
+    <w:p>
+      <w:pPr>
+        <w:spacing w:after="120" w:before="320"/>
+      </w:pPr>
+      <w:r>
+        <w:rPr>
+          <w:rFonts w:ascii="Times New Roman" w:cs="Times New Roman" w:eastAsia="Times New Roman" w:hAnsi="Times New Roman"/>
+          <w:b/>
+          <w:bCs/>
+          <w:color w:val="1B3A6B"/>
+          <w:sz w:val="30"/>
+          <w:szCs w:val="30"/>
+        </w:rPr>
+        <w:t xml:space="preserve">📝 Journal des corrections</w:t>
+      </w:r>
+    </w:p>
+    <w:p>
+      <w:pPr>
+        <w:spacing w:after="80" w:before="80"/>
+      </w:pPr>
+      <w:r>
+        <w:rPr>
+          <w:rFonts w:ascii="Times New Roman" w:cs="Times New Roman" w:eastAsia="Times New Roman" w:hAnsi="Times New Roman"/>
+          <w:b w:val="false"/>
+          <w:bCs w:val="false"/>
+          <w:color w:val="1F2937"/>
+          <w:sz w:val="22"/>
+          <w:szCs w:val="22"/>
+        </w:rPr>
+        <w:t xml:space="preserve">Leçon produite et relue le 22/08/2026. Les corrections sont fondues dans le texte ci-dessus ; les formulations d'origine sont conservées ici.</w:t>
+      </w:r>
+    </w:p>
+    <w:p>
+      <w:pPr>
+        <w:spacing w:after="80" w:before="80"/>
+      </w:pPr>
+      <w:r>
+        <w:rPr>
+          <w:rFonts w:ascii="Times New Roman" w:cs="Times New Roman" w:eastAsia="Times New Roman" w:hAnsi="Times New Roman"/>
+          <w:b w:val="false"/>
+          <w:bCs w:val="false"/>
+          <w:color w:val="1F2937"/>
+          <w:sz w:val="22"/>
+          <w:szCs w:val="22"/>
+        </w:rPr>
+        <w:t xml:space="preserve">1. Assiette de la CSG-CRDS sur l'intéressement placé — l'erreur principale.</w:t>
+      </w:r>
+    </w:p>
+    <w:p>
+      <w:pPr>
+        <w:spacing w:after="80" w:before="80"/>
+      </w:pPr>
+      <w:r>
+        <w:rPr>
+          <w:rFonts w:ascii="Times New Roman" w:cs="Times New Roman" w:eastAsia="Times New Roman" w:hAnsi="Times New Roman"/>
+          <w:b w:val="false"/>
+          <w:bCs w:val="false"/>
+          <w:color w:val="1F2937"/>
+          <w:sz w:val="22"/>
+          <w:szCs w:val="22"/>
+        </w:rPr>
+        <w:t xml:space="preserve">Version initiale, dans le corrigé de la situation A : « La CSG-CRDS (9,7 %) est prélevée à l'entrée sur l'abondement si l'employeur abonde, mais pas sur la prime d'intéressement elle-même placée par le salarié. » C'est l'inverse. Placer la prime sous 15 jours l'exonère de l'impôt sur le revenu, pas de la CSG-CRDS : les 9,7 % frappent à l'entrée du plan l'intéressement, la participation et l'abondement. Seuls les versements volontaires y échappent, puisqu'ils proviennent d'un salaire déjà soumis à la CSG — l'exercice 2, qui n'applique la CSG-CRDS qu'à l'abondement, reste donc juste. Vérifié le 22/08/2026 auprès de lafinancepourtous.com et d'economie.gouv.fr.</w:t>
+      </w:r>
+    </w:p>
+    <w:p>
+      <w:pPr>
+        <w:spacing w:after="80" w:before="80"/>
+      </w:pPr>
+      <w:r>
+        <w:rPr>
+          <w:rFonts w:ascii="Times New Roman" w:cs="Times New Roman" w:eastAsia="Times New Roman" w:hAnsi="Times New Roman"/>
+          <w:b w:val="false"/>
+          <w:bCs w:val="false"/>
+          <w:color w:val="1F2937"/>
+          <w:sz w:val="22"/>
+          <w:szCs w:val="22"/>
+        </w:rPr>
+        <w:t xml:space="preserve">2. Conséquence sur le challenge (scénarios A et B).</w:t>
+      </w:r>
+    </w:p>
+    <w:p>
+      <w:pPr>
+        <w:spacing w:after="80" w:before="80"/>
+      </w:pPr>
+      <w:r>
+        <w:rPr>
+          <w:rFonts w:ascii="Times New Roman" w:cs="Times New Roman" w:eastAsia="Times New Roman" w:hAnsi="Times New Roman"/>
+          <w:b w:val="false"/>
+          <w:bCs w:val="false"/>
+          <w:color w:val="1F2937"/>
+          <w:sz w:val="22"/>
+          <w:szCs w:val="22"/>
+        </w:rPr>
+        <w:t xml:space="preserve">Scénario B, version initiale : « Prime placée : 2 400 € (exonérée d'IR) » puis « Total dans le PERECO : 2 400 + 2 167,20 = 4 567,20 € ». La prime subit elle aussi 232,80 € de CSG-CRDS : le total réel est de 4 334,40 €. Scénario A, version initiale : « CSG-CRDS non déductible (environ 2,4 % × 2 400 €) : 57,60 € » et « Net en poche ≈ 1 622,40 € ». C'est la totalité des 9,7 % qui est prélevée à la source, soit 232,80 €, et non la seule fraction non déductible ; le net réel se situe entre 1 447 € et 1 496 € selon que la CSG déductible de 6,8 % réduit ou non la base imposable. Le ratio passe de 2,82 à environ 2,9. Les deux écarts jouaient en sens contraire : la conclusion du challenge — placer reste nettement plus avantageux — n'est pas modifiée.</w:t>
+      </w:r>
+    </w:p>
+    <w:p>
+      <w:pPr>
+        <w:spacing w:after="80" w:before="80"/>
+      </w:pPr>
+      <w:r>
+        <w:rPr>
+          <w:rFonts w:ascii="Times New Roman" w:cs="Times New Roman" w:eastAsia="Times New Roman" w:hAnsi="Times New Roman"/>
+          <w:b w:val="false"/>
+          <w:bCs w:val="false"/>
+          <w:color w:val="1F2937"/>
+          <w:sz w:val="22"/>
+          <w:szCs w:val="22"/>
+        </w:rPr>
+        <w:t xml:space="preserve">3. Taux des prélèvements sociaux sur les gains PEE à la sortie — incertitude levée.</w:t>
+      </w:r>
+    </w:p>
+    <w:p>
+      <w:pPr>
+        <w:spacing w:after="80" w:before="80"/>
+      </w:pPr>
+      <w:r>
+        <w:rPr>
+          <w:rFonts w:ascii="Times New Roman" w:cs="Times New Roman" w:eastAsia="Times New Roman" w:hAnsi="Times New Roman"/>
+          <w:b w:val="false"/>
+          <w:bCs w:val="false"/>
+          <w:color w:val="1F2937"/>
+          <w:sz w:val="22"/>
+          <w:szCs w:val="22"/>
+        </w:rPr>
+        <w:t xml:space="preserve">Version initiale : la leçon signalait honnêtement ne pas pouvoir trancher entre 17,2 % (affiché par economie.gouv.fr) et 18,6 %, et recommandait de vérifier. La vérification a été faite le 22/08/2026 : la page « La fiscalité de l'épargne salariale » de lafinancepourtous.com écrit explicitement 18,6 % pour les gains d'un PEE à la sortie. La page d'economie.gouv.fr n'est pas à jour sur ce point. Le passage a été réécrit en conséquence, et complété d'une distinction que la leçon ne faisait pas : la CSG-CRDS de 9,7 % prélevée à l'ENTRÉE n'a pas bougé en 2026, parce que la hausse de CSG vise les revenus du capital et non les revenus d'activité.</w:t>
+      </w:r>
+    </w:p>
+    <w:p>
+      <w:pPr>
+        <w:spacing w:after="80" w:before="80"/>
+      </w:pPr>
+      <w:r>
+        <w:rPr>
+          <w:rFonts w:ascii="Times New Roman" w:cs="Times New Roman" w:eastAsia="Times New Roman" w:hAnsi="Times New Roman"/>
+          <w:b w:val="false"/>
+          <w:bCs w:val="false"/>
+          <w:color w:val="1F2937"/>
+          <w:sz w:val="22"/>
+          <w:szCs w:val="22"/>
+        </w:rPr>
+        <w:t xml:space="preserve">Vérifié lors de la relecture et inchangé : le PASS 2026 à 48 060 € (arrêté du 22/12/2025) et toute la chaîne de plafonds qui en dérive — 36 045 € pour la participation et l'intéressement (75 %), 3 844,80 € d'abondement PEE (8 %), 6 920,64 € avec la majoration de 80 % pour l'actionnariat salarié, 7 689,60 € pour le PERECO (16 %) ; le délai de 15 jours pour l'exonération d'IR ; le taux de CSG-CRDS de 9,7 % ; et les calculs de l'exercice 2 (facteur d'annuités 7,898 à 4 % sur 7 ans, gain de 21 398 € apporté par l'abondement, soit +135 %).</w:t>
       </w:r>
     </w:p>
     <w:sectPr>

</xml_diff>